<commit_message>
feat: add scripts create db
</commit_message>
<xml_diff>
--- a/docs/user-guide/TaiLieu_Updated.docx
+++ b/docs/user-guide/TaiLieu_Updated.docx
@@ -95,6 +95,9 @@
       <w:r>
         <w:t>Quản lý chương trình giảm giá</w:t>
       </w:r>
+      <w:r>
+        <w:t xml:space="preserve"> </w:t>
+      </w:r>
     </w:p>
     <w:p>
       <w:pPr>
@@ -175,10 +178,10 @@
         <w:tblLook w:val="04A0" w:firstRow="1" w:lastRow="0" w:firstColumn="1" w:lastColumn="0" w:noHBand="0" w:noVBand="1"/>
       </w:tblPr>
       <w:tblGrid>
-        <w:gridCol w:w="1952"/>
-        <w:gridCol w:w="1647"/>
-        <w:gridCol w:w="2206"/>
-        <w:gridCol w:w="3051"/>
+        <w:gridCol w:w="1942"/>
+        <w:gridCol w:w="1650"/>
+        <w:gridCol w:w="2209"/>
+        <w:gridCol w:w="3055"/>
       </w:tblGrid>
       <w:tr>
         <w:trPr>
@@ -441,7 +444,7 @@
               <w:rPr>
                 <w:sz w:val="20"/>
               </w:rPr>
-              <w:t>passwordHash</w:t>
+              <w:t>password</w:t>
             </w:r>
           </w:p>
         </w:tc>
@@ -480,7 +483,7 @@
               <w:rPr>
                 <w:sz w:val="20"/>
               </w:rPr>
-              <w:t>Mật khẩu đã hash (BCrypt)</w:t>
+              <w:t xml:space="preserve">Mật khẩu </w:t>
             </w:r>
           </w:p>
         </w:tc>
@@ -659,6 +662,12 @@
                 <w:sz w:val="20"/>
               </w:rPr>
               <w:t>Số điện thoại</w:t>
+            </w:r>
+            <w:r>
+              <w:rPr>
+                <w:sz w:val="20"/>
+              </w:rPr>
+              <w:t>, có thể trống</w:t>
             </w:r>
           </w:p>
         </w:tc>
@@ -1596,6 +1605,12 @@
         </w:rPr>
         <w:t>2.3. CinemaHall (Phòng chiếu)</w:t>
       </w:r>
+      <w:r>
+        <w:rPr>
+          <w:rFonts w:ascii="Times New Roman" w:hAnsi="Times New Roman"/>
+        </w:rPr>
+        <w:t xml:space="preserve"> Done</w:t>
+      </w:r>
     </w:p>
     <w:p>
       <w:r>
@@ -2097,6 +2112,12 @@
           <w:rFonts w:ascii="Times New Roman" w:hAnsi="Times New Roman"/>
         </w:rPr>
         <w:t>2.4. Seat (Ghế ngồi)</w:t>
+      </w:r>
+      <w:r>
+        <w:rPr>
+          <w:rFonts w:ascii="Times New Roman" w:hAnsi="Times New Roman"/>
+        </w:rPr>
+        <w:t xml:space="preserve"> Done</w:t>
       </w:r>
     </w:p>
     <w:p>
@@ -3125,7 +3146,19 @@
               <w:rPr>
                 <w:sz w:val="20"/>
               </w:rPr>
-              <w:t>SCHEDULED | ONGOING | COMPLETED | CANCELLED</w:t>
+              <w:t xml:space="preserve">SCHEDULED | </w:t>
+            </w:r>
+            <w:r>
+              <w:rPr>
+                <w:sz w:val="20"/>
+              </w:rPr>
+              <w:t>UPCOMMING</w:t>
+            </w:r>
+            <w:r>
+              <w:rPr>
+                <w:sz w:val="20"/>
+              </w:rPr>
+              <w:t xml:space="preserve"> | COMPLETED | CANCELLED</w:t>
             </w:r>
           </w:p>
         </w:tc>
@@ -4241,10 +4274,12 @@
     <w:p>
       <w:pPr>
         <w:pStyle w:val="ListBullet"/>
+        <w:numPr>
+          <w:ilvl w:val="0"/>
+          <w:numId w:val="0"/>
+        </w:numPr>
+        <w:ind w:left="360"/>
       </w:pPr>
-      <w:r>
-        <w:t>Đã bỏ InvoiceDetail — Invoice liên kết trực tiếp tới Ticket (1-N)</w:t>
-      </w:r>
     </w:p>
     <w:p>
       <w:pPr>
@@ -6262,58 +6297,6 @@
         <w:rPr>
           <w:rFonts w:ascii="Times New Roman" w:hAnsi="Times New Roman"/>
         </w:rPr>
-        <w:t>4. Những thay đổi so với bản trước</w:t>
-      </w:r>
-    </w:p>
-    <w:p>
-      <w:r>
-        <w:rPr>
-          <w:b/>
-        </w:rPr>
-        <w:t>Các thành phần đã loại bỏ:</w:t>
-      </w:r>
-    </w:p>
-    <w:p>
-      <w:pPr>
-        <w:pStyle w:val="ListBullet"/>
-      </w:pPr>
-      <w:r>
-        <w:t>Bỏ class Service — scope hiện tại chỉ bán vé, không bán dịch vụ kèm theo</w:t>
-      </w:r>
-    </w:p>
-    <w:p>
-      <w:pPr>
-        <w:pStyle w:val="ListBullet"/>
-      </w:pPr>
-      <w:r>
-        <w:t>Bỏ class InvoiceDetail — Invoice liên kết trực tiếp tới Ticket (1-N), tránh dư thừa và mâu thuẫn quantity/ticket_id</w:t>
-      </w:r>
-    </w:p>
-    <w:p>
-      <w:pPr>
-        <w:pStyle w:val="ListBullet"/>
-      </w:pPr>
-      <w:r>
-        <w:t>Bỏ các thuộc tính itemType, serviceId, quantity kiểu line-item hỗn hợp trong hóa đơn</w:t>
-      </w:r>
-    </w:p>
-    <w:p>
-      <w:pPr>
-        <w:pStyle w:val="ListBullet"/>
-      </w:pPr>
-      <w:r>
-        <w:t>Bỏ logic "ghế ACCESSIBLE thì tự động giảm giá người khuyết tật" — sai nghiệp vụ (loại ghế ≠ đối tượng giảm giá)</w:t>
-      </w:r>
-    </w:p>
-    <w:p>
-      <w:pPr>
-        <w:pStyle w:val="Heading1"/>
-      </w:pPr>
-      <w:r>
-        <w:rPr>
-          <w:rFonts w:ascii="Times New Roman" w:hAnsi="Times New Roman"/>
-        </w:rPr>
-        <w:lastRenderedPageBreak/>
         <w:t>5. Logic đăng nhập</w:t>
       </w:r>
     </w:p>
@@ -6342,11 +6325,6 @@
     </w:p>
     <w:p>
       <w:r>
-        <w:t>4. Hệ thống xác minh password (so sánh hash) → nếu sai: báo lỗi mật khẩu.</w:t>
-      </w:r>
-    </w:p>
-    <w:p>
-      <w:r>
         <w:t>5. Đăng nhập thành công → điều hướng theo role:</w:t>
       </w:r>
     </w:p>
@@ -6363,6 +6341,7 @@
         <w:pStyle w:val="ListBullet"/>
       </w:pPr>
       <w:r>
+        <w:lastRenderedPageBreak/>
         <w:t>role = STAFF → mở Staff page (bán vé, xem lịch chiếu, ...)</w:t>
       </w:r>
     </w:p>
@@ -6392,563 +6371,11 @@
         </w:rPr>
         <w:t>6.1. Bảng employees</w:t>
       </w:r>
-    </w:p>
-    <w:tbl>
-      <w:tblPr>
-        <w:tblStyle w:val="TableGrid"/>
-        <w:tblW w:w="0" w:type="auto"/>
-        <w:jc w:val="center"/>
-        <w:tblLook w:val="04A0" w:firstRow="1" w:lastRow="0" w:firstColumn="1" w:lastColumn="0" w:noHBand="0" w:noVBand="1"/>
-      </w:tblPr>
-      <w:tblGrid>
-        <w:gridCol w:w="2160"/>
-        <w:gridCol w:w="2160"/>
-        <w:gridCol w:w="2160"/>
-        <w:gridCol w:w="2160"/>
-      </w:tblGrid>
-      <w:tr>
-        <w:trPr>
-          <w:jc w:val="center"/>
-        </w:trPr>
-        <w:tc>
-          <w:tcPr>
-            <w:tcW w:w="2160" w:type="dxa"/>
-            <w:shd w:val="clear" w:color="auto" w:fill="D9E2F3"/>
-          </w:tcPr>
-          <w:p>
-            <w:pPr>
-              <w:jc w:val="center"/>
-            </w:pPr>
-            <w:r>
-              <w:rPr>
-                <w:b/>
-                <w:sz w:val="20"/>
-              </w:rPr>
-              <w:t>Cột</w:t>
-            </w:r>
-          </w:p>
-        </w:tc>
-        <w:tc>
-          <w:tcPr>
-            <w:tcW w:w="2160" w:type="dxa"/>
-            <w:shd w:val="clear" w:color="auto" w:fill="D9E2F3"/>
-          </w:tcPr>
-          <w:p>
-            <w:pPr>
-              <w:jc w:val="center"/>
-            </w:pPr>
-            <w:r>
-              <w:rPr>
-                <w:b/>
-                <w:sz w:val="20"/>
-              </w:rPr>
-              <w:t>Kiểu</w:t>
-            </w:r>
-          </w:p>
-        </w:tc>
-        <w:tc>
-          <w:tcPr>
-            <w:tcW w:w="2160" w:type="dxa"/>
-            <w:shd w:val="clear" w:color="auto" w:fill="D9E2F3"/>
-          </w:tcPr>
-          <w:p>
-            <w:pPr>
-              <w:jc w:val="center"/>
-            </w:pPr>
-            <w:r>
-              <w:rPr>
-                <w:b/>
-                <w:sz w:val="20"/>
-              </w:rPr>
-              <w:t>Ràng buộc</w:t>
-            </w:r>
-          </w:p>
-        </w:tc>
-        <w:tc>
-          <w:tcPr>
-            <w:tcW w:w="2160" w:type="dxa"/>
-            <w:shd w:val="clear" w:color="auto" w:fill="D9E2F3"/>
-          </w:tcPr>
-          <w:p>
-            <w:pPr>
-              <w:jc w:val="center"/>
-            </w:pPr>
-            <w:r>
-              <w:rPr>
-                <w:b/>
-                <w:sz w:val="20"/>
-              </w:rPr>
-              <w:t>Mô tả</w:t>
-            </w:r>
-          </w:p>
-        </w:tc>
-      </w:tr>
-      <w:tr>
-        <w:trPr>
-          <w:jc w:val="center"/>
-        </w:trPr>
-        <w:tc>
-          <w:tcPr>
-            <w:tcW w:w="2160" w:type="dxa"/>
-          </w:tcPr>
-          <w:p>
-            <w:r>
-              <w:rPr>
-                <w:sz w:val="20"/>
-              </w:rPr>
-              <w:t>employee_id</w:t>
-            </w:r>
-          </w:p>
-        </w:tc>
-        <w:tc>
-          <w:tcPr>
-            <w:tcW w:w="2160" w:type="dxa"/>
-          </w:tcPr>
-          <w:p>
-            <w:r>
-              <w:rPr>
-                <w:sz w:val="20"/>
-              </w:rPr>
-              <w:t>VARCHAR(20)</w:t>
-            </w:r>
-          </w:p>
-        </w:tc>
-        <w:tc>
-          <w:tcPr>
-            <w:tcW w:w="2160" w:type="dxa"/>
-          </w:tcPr>
-          <w:p>
-            <w:r>
-              <w:rPr>
-                <w:sz w:val="20"/>
-              </w:rPr>
-              <w:t>PK</w:t>
-            </w:r>
-          </w:p>
-        </w:tc>
-        <w:tc>
-          <w:tcPr>
-            <w:tcW w:w="2160" w:type="dxa"/>
-          </w:tcPr>
-          <w:p>
-            <w:r>
-              <w:rPr>
-                <w:sz w:val="20"/>
-              </w:rPr>
-              <w:t>Mã nhân viên, khóa chính,duy nhất, không cho phép nhập, được sinh ra dựa theo mã phía trước thiết lập mẫu EMP001,EMP002…</w:t>
-            </w:r>
-          </w:p>
-        </w:tc>
-      </w:tr>
-      <w:tr>
-        <w:trPr>
-          <w:jc w:val="center"/>
-        </w:trPr>
-        <w:tc>
-          <w:tcPr>
-            <w:tcW w:w="2160" w:type="dxa"/>
-          </w:tcPr>
-          <w:p>
-            <w:r>
-              <w:rPr>
-                <w:sz w:val="20"/>
-              </w:rPr>
-              <w:t>full_name</w:t>
-            </w:r>
-          </w:p>
-        </w:tc>
-        <w:tc>
-          <w:tcPr>
-            <w:tcW w:w="2160" w:type="dxa"/>
-          </w:tcPr>
-          <w:p>
-            <w:r>
-              <w:rPr>
-                <w:sz w:val="20"/>
-              </w:rPr>
-              <w:t>NVARCHAR(100)</w:t>
-            </w:r>
-          </w:p>
-        </w:tc>
-        <w:tc>
-          <w:tcPr>
-            <w:tcW w:w="2160" w:type="dxa"/>
-          </w:tcPr>
-          <w:p>
-            <w:r>
-              <w:rPr>
-                <w:sz w:val="20"/>
-              </w:rPr>
-              <w:t>NOT NULL</w:t>
-            </w:r>
-          </w:p>
-        </w:tc>
-        <w:tc>
-          <w:tcPr>
-            <w:tcW w:w="2160" w:type="dxa"/>
-          </w:tcPr>
-          <w:p>
-            <w:r>
-              <w:rPr>
-                <w:sz w:val="20"/>
-              </w:rPr>
-              <w:t>Họ tên đầy đủ</w:t>
-            </w:r>
-          </w:p>
-        </w:tc>
-      </w:tr>
-      <w:tr>
-        <w:trPr>
-          <w:jc w:val="center"/>
-        </w:trPr>
-        <w:tc>
-          <w:tcPr>
-            <w:tcW w:w="2160" w:type="dxa"/>
-          </w:tcPr>
-          <w:p>
-            <w:r>
-              <w:rPr>
-                <w:sz w:val="20"/>
-              </w:rPr>
-              <w:t>username</w:t>
-            </w:r>
-          </w:p>
-        </w:tc>
-        <w:tc>
-          <w:tcPr>
-            <w:tcW w:w="2160" w:type="dxa"/>
-          </w:tcPr>
-          <w:p>
-            <w:r>
-              <w:rPr>
-                <w:sz w:val="20"/>
-              </w:rPr>
-              <w:t>VARCHAR(50)</w:t>
-            </w:r>
-          </w:p>
-        </w:tc>
-        <w:tc>
-          <w:tcPr>
-            <w:tcW w:w="2160" w:type="dxa"/>
-          </w:tcPr>
-          <w:p>
-            <w:r>
-              <w:rPr>
-                <w:sz w:val="20"/>
-              </w:rPr>
-              <w:t>NOT NULL, UNIQUE</w:t>
-            </w:r>
-          </w:p>
-        </w:tc>
-        <w:tc>
-          <w:tcPr>
-            <w:tcW w:w="2160" w:type="dxa"/>
-          </w:tcPr>
-          <w:p>
-            <w:r>
-              <w:rPr>
-                <w:sz w:val="20"/>
-              </w:rPr>
-              <w:t>Tên đăng nhập</w:t>
-            </w:r>
-          </w:p>
-        </w:tc>
-      </w:tr>
-      <w:tr>
-        <w:trPr>
-          <w:jc w:val="center"/>
-        </w:trPr>
-        <w:tc>
-          <w:tcPr>
-            <w:tcW w:w="2160" w:type="dxa"/>
-          </w:tcPr>
-          <w:p>
-            <w:r>
-              <w:rPr>
-                <w:sz w:val="20"/>
-              </w:rPr>
-              <w:t>password_hash</w:t>
-            </w:r>
-          </w:p>
-        </w:tc>
-        <w:tc>
-          <w:tcPr>
-            <w:tcW w:w="2160" w:type="dxa"/>
-          </w:tcPr>
-          <w:p>
-            <w:r>
-              <w:rPr>
-                <w:sz w:val="20"/>
-              </w:rPr>
-              <w:t>VARCHAR(255)</w:t>
-            </w:r>
-          </w:p>
-        </w:tc>
-        <w:tc>
-          <w:tcPr>
-            <w:tcW w:w="2160" w:type="dxa"/>
-          </w:tcPr>
-          <w:p>
-            <w:r>
-              <w:rPr>
-                <w:sz w:val="20"/>
-              </w:rPr>
-              <w:t>NOT NULL</w:t>
-            </w:r>
-          </w:p>
-        </w:tc>
-        <w:tc>
-          <w:tcPr>
-            <w:tcW w:w="2160" w:type="dxa"/>
-          </w:tcPr>
-          <w:p>
-            <w:r>
-              <w:rPr>
-                <w:sz w:val="20"/>
-              </w:rPr>
-              <w:t>Mật khẩu hash</w:t>
-            </w:r>
-          </w:p>
-        </w:tc>
-      </w:tr>
-      <w:tr>
-        <w:trPr>
-          <w:jc w:val="center"/>
-        </w:trPr>
-        <w:tc>
-          <w:tcPr>
-            <w:tcW w:w="2160" w:type="dxa"/>
-          </w:tcPr>
-          <w:p>
-            <w:r>
-              <w:rPr>
-                <w:sz w:val="20"/>
-              </w:rPr>
-              <w:t>role</w:t>
-            </w:r>
-          </w:p>
-        </w:tc>
-        <w:tc>
-          <w:tcPr>
-            <w:tcW w:w="2160" w:type="dxa"/>
-          </w:tcPr>
-          <w:p>
-            <w:r>
-              <w:rPr>
-                <w:sz w:val="20"/>
-              </w:rPr>
-              <w:t>VARCHAR(20)</w:t>
-            </w:r>
-          </w:p>
-        </w:tc>
-        <w:tc>
-          <w:tcPr>
-            <w:tcW w:w="2160" w:type="dxa"/>
-          </w:tcPr>
-          <w:p>
-            <w:r>
-              <w:rPr>
-                <w:sz w:val="20"/>
-              </w:rPr>
-              <w:t>NOT NULL, CHECK IN ('MANAGER','STAFF')</w:t>
-            </w:r>
-          </w:p>
-        </w:tc>
-        <w:tc>
-          <w:tcPr>
-            <w:tcW w:w="2160" w:type="dxa"/>
-          </w:tcPr>
-          <w:p>
-            <w:r>
-              <w:rPr>
-                <w:sz w:val="20"/>
-              </w:rPr>
-              <w:t>Vai trò</w:t>
-            </w:r>
-          </w:p>
-        </w:tc>
-      </w:tr>
-      <w:tr>
-        <w:trPr>
-          <w:jc w:val="center"/>
-        </w:trPr>
-        <w:tc>
-          <w:tcPr>
-            <w:tcW w:w="2160" w:type="dxa"/>
-          </w:tcPr>
-          <w:p>
-            <w:r>
-              <w:rPr>
-                <w:sz w:val="20"/>
-              </w:rPr>
-              <w:t>status</w:t>
-            </w:r>
-          </w:p>
-        </w:tc>
-        <w:tc>
-          <w:tcPr>
-            <w:tcW w:w="2160" w:type="dxa"/>
-          </w:tcPr>
-          <w:p>
-            <w:r>
-              <w:rPr>
-                <w:sz w:val="20"/>
-              </w:rPr>
-              <w:t>VARCHAR(20)</w:t>
-            </w:r>
-          </w:p>
-        </w:tc>
-        <w:tc>
-          <w:tcPr>
-            <w:tcW w:w="2160" w:type="dxa"/>
-          </w:tcPr>
-          <w:p>
-            <w:r>
-              <w:rPr>
-                <w:sz w:val="20"/>
-              </w:rPr>
-              <w:t>NOT NULL, DEFAULT 'ACTIVE'</w:t>
-            </w:r>
-          </w:p>
-        </w:tc>
-        <w:tc>
-          <w:tcPr>
-            <w:tcW w:w="2160" w:type="dxa"/>
-          </w:tcPr>
-          <w:p>
-            <w:r>
-              <w:rPr>
-                <w:sz w:val="20"/>
-              </w:rPr>
-              <w:t>ACTIVE | INACTIVE</w:t>
-            </w:r>
-          </w:p>
-        </w:tc>
-      </w:tr>
-      <w:tr>
-        <w:trPr>
-          <w:jc w:val="center"/>
-        </w:trPr>
-        <w:tc>
-          <w:tcPr>
-            <w:tcW w:w="2160" w:type="dxa"/>
-          </w:tcPr>
-          <w:p>
-            <w:r>
-              <w:rPr>
-                <w:sz w:val="20"/>
-              </w:rPr>
-              <w:t>phone</w:t>
-            </w:r>
-          </w:p>
-        </w:tc>
-        <w:tc>
-          <w:tcPr>
-            <w:tcW w:w="2160" w:type="dxa"/>
-          </w:tcPr>
-          <w:p>
-            <w:r>
-              <w:rPr>
-                <w:sz w:val="20"/>
-              </w:rPr>
-              <w:t>VARCHAR(20)</w:t>
-            </w:r>
-          </w:p>
-        </w:tc>
-        <w:tc>
-          <w:tcPr>
-            <w:tcW w:w="2160" w:type="dxa"/>
-          </w:tcPr>
-          <w:p>
-            <w:r>
-              <w:rPr>
-                <w:sz w:val="20"/>
-              </w:rPr>
-              <w:t>NULL</w:t>
-            </w:r>
-          </w:p>
-        </w:tc>
-        <w:tc>
-          <w:tcPr>
-            <w:tcW w:w="2160" w:type="dxa"/>
-          </w:tcPr>
-          <w:p>
-            <w:r>
-              <w:rPr>
-                <w:sz w:val="20"/>
-              </w:rPr>
-              <w:t>SĐT</w:t>
-            </w:r>
-          </w:p>
-        </w:tc>
-      </w:tr>
-      <w:tr>
-        <w:trPr>
-          <w:jc w:val="center"/>
-        </w:trPr>
-        <w:tc>
-          <w:tcPr>
-            <w:tcW w:w="2160" w:type="dxa"/>
-          </w:tcPr>
-          <w:p>
-            <w:r>
-              <w:rPr>
-                <w:sz w:val="20"/>
-              </w:rPr>
-              <w:t>email</w:t>
-            </w:r>
-          </w:p>
-        </w:tc>
-        <w:tc>
-          <w:tcPr>
-            <w:tcW w:w="2160" w:type="dxa"/>
-          </w:tcPr>
-          <w:p>
-            <w:r>
-              <w:rPr>
-                <w:sz w:val="20"/>
-              </w:rPr>
-              <w:t>VARCHAR(100)</w:t>
-            </w:r>
-          </w:p>
-        </w:tc>
-        <w:tc>
-          <w:tcPr>
-            <w:tcW w:w="2160" w:type="dxa"/>
-          </w:tcPr>
-          <w:p>
-            <w:r>
-              <w:rPr>
-                <w:sz w:val="20"/>
-              </w:rPr>
-              <w:t>UNIQUE, NULL</w:t>
-            </w:r>
-          </w:p>
-        </w:tc>
-        <w:tc>
-          <w:tcPr>
-            <w:tcW w:w="2160" w:type="dxa"/>
-          </w:tcPr>
-          <w:p>
-            <w:r>
-              <w:rPr>
-                <w:sz w:val="20"/>
-              </w:rPr>
-              <w:t>Email</w:t>
-            </w:r>
-          </w:p>
-        </w:tc>
-      </w:tr>
-    </w:tbl>
-    <w:p>
-      <w:pPr>
-        <w:pStyle w:val="Heading2"/>
-      </w:pPr>
       <w:r>
         <w:rPr>
           <w:rFonts w:ascii="Times New Roman" w:hAnsi="Times New Roman"/>
         </w:rPr>
-        <w:t>6.2. Bảng movies</w:t>
+        <w:t xml:space="preserve"> ( Done)</w:t>
       </w:r>
     </w:p>
     <w:tbl>
@@ -7054,7 +6481,7 @@
               <w:rPr>
                 <w:sz w:val="20"/>
               </w:rPr>
-              <w:t>movie_id</w:t>
+              <w:t>employee_id</w:t>
             </w:r>
           </w:p>
         </w:tc>
@@ -7082,18 +6509,24 @@
               </w:rPr>
               <w:t>PK</w:t>
             </w:r>
-          </w:p>
-        </w:tc>
-        <w:tc>
-          <w:tcPr>
-            <w:tcW w:w="2160" w:type="dxa"/>
-          </w:tcPr>
-          <w:p>
-            <w:r>
-              <w:rPr>
-                <w:sz w:val="20"/>
-              </w:rPr>
-              <w:t>Mã phim</w:t>
+            <w:r>
+              <w:rPr>
+                <w:sz w:val="20"/>
+              </w:rPr>
+              <w:t>,NOT NULL</w:t>
+            </w:r>
+          </w:p>
+        </w:tc>
+        <w:tc>
+          <w:tcPr>
+            <w:tcW w:w="2160" w:type="dxa"/>
+          </w:tcPr>
+          <w:p>
+            <w:r>
+              <w:rPr>
+                <w:sz w:val="20"/>
+              </w:rPr>
+              <w:t>Mã nhân viên, khóa chính,duy nhất, không cho phép nhập, được sinh ra dựa theo mã phía trước thiết lập mẫu EMP001,EMP002…</w:t>
             </w:r>
           </w:p>
         </w:tc>
@@ -7111,20 +6544,20 @@
               <w:rPr>
                 <w:sz w:val="20"/>
               </w:rPr>
-              <w:t>title</w:t>
-            </w:r>
-          </w:p>
-        </w:tc>
-        <w:tc>
-          <w:tcPr>
-            <w:tcW w:w="2160" w:type="dxa"/>
-          </w:tcPr>
-          <w:p>
-            <w:r>
-              <w:rPr>
-                <w:sz w:val="20"/>
-              </w:rPr>
-              <w:t>NVARCHAR(200)</w:t>
+              <w:t>full_name</w:t>
+            </w:r>
+          </w:p>
+        </w:tc>
+        <w:tc>
+          <w:tcPr>
+            <w:tcW w:w="2160" w:type="dxa"/>
+          </w:tcPr>
+          <w:p>
+            <w:r>
+              <w:rPr>
+                <w:sz w:val="20"/>
+              </w:rPr>
+              <w:t>NVARCHAR(100)</w:t>
             </w:r>
           </w:p>
         </w:tc>
@@ -7150,7 +6583,7 @@
               <w:rPr>
                 <w:sz w:val="20"/>
               </w:rPr>
-              <w:t>Tên phim</w:t>
+              <w:t>Họ tên đầy đủ</w:t>
             </w:r>
           </w:p>
         </w:tc>
@@ -7168,46 +6601,46 @@
               <w:rPr>
                 <w:sz w:val="20"/>
               </w:rPr>
-              <w:t>genre</w:t>
-            </w:r>
-          </w:p>
-        </w:tc>
-        <w:tc>
-          <w:tcPr>
-            <w:tcW w:w="2160" w:type="dxa"/>
-          </w:tcPr>
-          <w:p>
-            <w:r>
-              <w:rPr>
-                <w:sz w:val="20"/>
-              </w:rPr>
-              <w:t>NVARCHAR(100)</w:t>
-            </w:r>
-          </w:p>
-        </w:tc>
-        <w:tc>
-          <w:tcPr>
-            <w:tcW w:w="2160" w:type="dxa"/>
-          </w:tcPr>
-          <w:p>
-            <w:r>
-              <w:rPr>
-                <w:sz w:val="20"/>
-              </w:rPr>
-              <w:t>NOT NULL</w:t>
-            </w:r>
-          </w:p>
-        </w:tc>
-        <w:tc>
-          <w:tcPr>
-            <w:tcW w:w="2160" w:type="dxa"/>
-          </w:tcPr>
-          <w:p>
-            <w:r>
-              <w:rPr>
-                <w:sz w:val="20"/>
-              </w:rPr>
-              <w:t>Thể loại</w:t>
+              <w:t>username</w:t>
+            </w:r>
+          </w:p>
+        </w:tc>
+        <w:tc>
+          <w:tcPr>
+            <w:tcW w:w="2160" w:type="dxa"/>
+          </w:tcPr>
+          <w:p>
+            <w:r>
+              <w:rPr>
+                <w:sz w:val="20"/>
+              </w:rPr>
+              <w:t>VARCHAR(50)</w:t>
+            </w:r>
+          </w:p>
+        </w:tc>
+        <w:tc>
+          <w:tcPr>
+            <w:tcW w:w="2160" w:type="dxa"/>
+          </w:tcPr>
+          <w:p>
+            <w:r>
+              <w:rPr>
+                <w:sz w:val="20"/>
+              </w:rPr>
+              <w:t>NOT NULL, UNIQUE</w:t>
+            </w:r>
+          </w:p>
+        </w:tc>
+        <w:tc>
+          <w:tcPr>
+            <w:tcW w:w="2160" w:type="dxa"/>
+          </w:tcPr>
+          <w:p>
+            <w:r>
+              <w:rPr>
+                <w:sz w:val="20"/>
+              </w:rPr>
+              <w:t>Tên đăng nhập</w:t>
             </w:r>
           </w:p>
         </w:tc>
@@ -7225,46 +6658,58 @@
               <w:rPr>
                 <w:sz w:val="20"/>
               </w:rPr>
-              <w:t>duration_mins</w:t>
-            </w:r>
-          </w:p>
-        </w:tc>
-        <w:tc>
-          <w:tcPr>
-            <w:tcW w:w="2160" w:type="dxa"/>
-          </w:tcPr>
-          <w:p>
-            <w:r>
-              <w:rPr>
-                <w:sz w:val="20"/>
-              </w:rPr>
-              <w:t>INT</w:t>
-            </w:r>
-          </w:p>
-        </w:tc>
-        <w:tc>
-          <w:tcPr>
-            <w:tcW w:w="2160" w:type="dxa"/>
-          </w:tcPr>
-          <w:p>
-            <w:r>
-              <w:rPr>
-                <w:sz w:val="20"/>
-              </w:rPr>
-              <w:t>NOT NULL, CHECK &gt; 0</w:t>
-            </w:r>
-          </w:p>
-        </w:tc>
-        <w:tc>
-          <w:tcPr>
-            <w:tcW w:w="2160" w:type="dxa"/>
-          </w:tcPr>
-          <w:p>
-            <w:r>
-              <w:rPr>
-                <w:sz w:val="20"/>
-              </w:rPr>
-              <w:t>Thời lượng (phút)</w:t>
+              <w:t>P</w:t>
+            </w:r>
+            <w:r>
+              <w:rPr>
+                <w:sz w:val="20"/>
+              </w:rPr>
+              <w:t>assword</w:t>
+            </w:r>
+          </w:p>
+        </w:tc>
+        <w:tc>
+          <w:tcPr>
+            <w:tcW w:w="2160" w:type="dxa"/>
+          </w:tcPr>
+          <w:p>
+            <w:r>
+              <w:rPr>
+                <w:sz w:val="20"/>
+              </w:rPr>
+              <w:t>VARCHAR(255)</w:t>
+            </w:r>
+          </w:p>
+        </w:tc>
+        <w:tc>
+          <w:tcPr>
+            <w:tcW w:w="2160" w:type="dxa"/>
+          </w:tcPr>
+          <w:p>
+            <w:r>
+              <w:rPr>
+                <w:sz w:val="20"/>
+              </w:rPr>
+              <w:t>NOT NULL</w:t>
+            </w:r>
+          </w:p>
+        </w:tc>
+        <w:tc>
+          <w:tcPr>
+            <w:tcW w:w="2160" w:type="dxa"/>
+          </w:tcPr>
+          <w:p>
+            <w:r>
+              <w:rPr>
+                <w:sz w:val="20"/>
+              </w:rPr>
+              <w:t>Mật khẩ</w:t>
+            </w:r>
+            <w:r>
+              <w:rPr>
+                <w:sz w:val="20"/>
+              </w:rPr>
+              <w:t>t</w:t>
             </w:r>
           </w:p>
         </w:tc>
@@ -7282,46 +6727,46 @@
               <w:rPr>
                 <w:sz w:val="20"/>
               </w:rPr>
-              <w:t>Language</w:t>
-            </w:r>
-          </w:p>
-        </w:tc>
-        <w:tc>
-          <w:tcPr>
-            <w:tcW w:w="2160" w:type="dxa"/>
-          </w:tcPr>
-          <w:p>
-            <w:r>
-              <w:rPr>
-                <w:sz w:val="20"/>
-              </w:rPr>
-              <w:t>NVARCHAR(50)</w:t>
-            </w:r>
-          </w:p>
-        </w:tc>
-        <w:tc>
-          <w:tcPr>
-            <w:tcW w:w="2160" w:type="dxa"/>
-          </w:tcPr>
-          <w:p>
-            <w:r>
-              <w:rPr>
-                <w:sz w:val="20"/>
-              </w:rPr>
-              <w:t>NULL</w:t>
-            </w:r>
-          </w:p>
-        </w:tc>
-        <w:tc>
-          <w:tcPr>
-            <w:tcW w:w="2160" w:type="dxa"/>
-          </w:tcPr>
-          <w:p>
-            <w:r>
-              <w:rPr>
-                <w:sz w:val="20"/>
-              </w:rPr>
-              <w:t>Ngôn ngữ</w:t>
+              <w:t>role</w:t>
+            </w:r>
+          </w:p>
+        </w:tc>
+        <w:tc>
+          <w:tcPr>
+            <w:tcW w:w="2160" w:type="dxa"/>
+          </w:tcPr>
+          <w:p>
+            <w:r>
+              <w:rPr>
+                <w:sz w:val="20"/>
+              </w:rPr>
+              <w:t>VARCHAR(20)</w:t>
+            </w:r>
+          </w:p>
+        </w:tc>
+        <w:tc>
+          <w:tcPr>
+            <w:tcW w:w="2160" w:type="dxa"/>
+          </w:tcPr>
+          <w:p>
+            <w:r>
+              <w:rPr>
+                <w:sz w:val="20"/>
+              </w:rPr>
+              <w:t>NOT NULL, CHECK IN ('MANAGER','STAFF')</w:t>
+            </w:r>
+          </w:p>
+        </w:tc>
+        <w:tc>
+          <w:tcPr>
+            <w:tcW w:w="2160" w:type="dxa"/>
+          </w:tcPr>
+          <w:p>
+            <w:r>
+              <w:rPr>
+                <w:sz w:val="20"/>
+              </w:rPr>
+              <w:t>Vai trò</w:t>
             </w:r>
           </w:p>
         </w:tc>
@@ -7339,47 +6784,52 @@
               <w:rPr>
                 <w:sz w:val="20"/>
               </w:rPr>
-              <w:lastRenderedPageBreak/>
-              <w:t>release_date</w:t>
-            </w:r>
-          </w:p>
-        </w:tc>
-        <w:tc>
-          <w:tcPr>
-            <w:tcW w:w="2160" w:type="dxa"/>
-          </w:tcPr>
-          <w:p>
-            <w:r>
-              <w:rPr>
-                <w:sz w:val="20"/>
-              </w:rPr>
-              <w:t>DATE</w:t>
-            </w:r>
-          </w:p>
-        </w:tc>
-        <w:tc>
-          <w:tcPr>
-            <w:tcW w:w="2160" w:type="dxa"/>
-          </w:tcPr>
-          <w:p>
-            <w:r>
-              <w:rPr>
-                <w:sz w:val="20"/>
-              </w:rPr>
-              <w:t>NULL</w:t>
-            </w:r>
-          </w:p>
-        </w:tc>
-        <w:tc>
-          <w:tcPr>
-            <w:tcW w:w="2160" w:type="dxa"/>
-          </w:tcPr>
-          <w:p>
-            <w:r>
-              <w:rPr>
-                <w:sz w:val="20"/>
-              </w:rPr>
-              <w:t>Ngày phát hành</w:t>
+              <w:t>status</w:t>
+            </w:r>
+          </w:p>
+        </w:tc>
+        <w:tc>
+          <w:tcPr>
+            <w:tcW w:w="2160" w:type="dxa"/>
+          </w:tcPr>
+          <w:p>
+            <w:r>
+              <w:rPr>
+                <w:sz w:val="20"/>
+              </w:rPr>
+              <w:t>VARCHAR(20)</w:t>
+            </w:r>
+          </w:p>
+        </w:tc>
+        <w:tc>
+          <w:tcPr>
+            <w:tcW w:w="2160" w:type="dxa"/>
+          </w:tcPr>
+          <w:p>
+            <w:r>
+              <w:rPr>
+                <w:sz w:val="20"/>
+              </w:rPr>
+              <w:t>NOT NULL, DEFAULT 'ACTIVE'</w:t>
+            </w:r>
+          </w:p>
+        </w:tc>
+        <w:tc>
+          <w:tcPr>
+            <w:tcW w:w="2160" w:type="dxa"/>
+          </w:tcPr>
+          <w:p>
+            <w:r>
+              <w:rPr>
+                <w:sz w:val="20"/>
+              </w:rPr>
+              <w:t xml:space="preserve">ACTIVE | </w:t>
+            </w:r>
+            <w:r>
+              <w:rPr>
+                <w:sz w:val="20"/>
+              </w:rPr>
+              <w:t>RETIRED</w:t>
             </w:r>
           </w:p>
         </w:tc>
@@ -7397,7 +6847,7 @@
               <w:rPr>
                 <w:sz w:val="20"/>
               </w:rPr>
-              <w:t>status</w:t>
+              <w:t>phone</w:t>
             </w:r>
           </w:p>
         </w:tc>
@@ -7423,20 +6873,20 @@
               <w:rPr>
                 <w:sz w:val="20"/>
               </w:rPr>
-              <w:t>NOT NULL, DEFAULT 'ACTIVE'</w:t>
-            </w:r>
-          </w:p>
-        </w:tc>
-        <w:tc>
-          <w:tcPr>
-            <w:tcW w:w="2160" w:type="dxa"/>
-          </w:tcPr>
-          <w:p>
-            <w:r>
-              <w:rPr>
-                <w:sz w:val="20"/>
-              </w:rPr>
-              <w:t>ACTIVE | INACTIVE</w:t>
+              <w:t>NULL</w:t>
+            </w:r>
+          </w:p>
+        </w:tc>
+        <w:tc>
+          <w:tcPr>
+            <w:tcW w:w="2160" w:type="dxa"/>
+          </w:tcPr>
+          <w:p>
+            <w:r>
+              <w:rPr>
+                <w:sz w:val="20"/>
+              </w:rPr>
+              <w:t>SĐT</w:t>
             </w:r>
           </w:p>
         </w:tc>
@@ -7454,46 +6904,154 @@
               <w:rPr>
                 <w:sz w:val="20"/>
               </w:rPr>
-              <w:t>description</w:t>
-            </w:r>
-          </w:p>
-        </w:tc>
-        <w:tc>
-          <w:tcPr>
-            <w:tcW w:w="2160" w:type="dxa"/>
-          </w:tcPr>
-          <w:p>
-            <w:r>
-              <w:rPr>
-                <w:sz w:val="20"/>
-              </w:rPr>
-              <w:t>NTEXT</w:t>
-            </w:r>
-          </w:p>
-        </w:tc>
-        <w:tc>
-          <w:tcPr>
-            <w:tcW w:w="2160" w:type="dxa"/>
-          </w:tcPr>
-          <w:p>
-            <w:r>
-              <w:rPr>
-                <w:sz w:val="20"/>
-              </w:rPr>
-              <w:t>NULL</w:t>
-            </w:r>
-          </w:p>
-        </w:tc>
-        <w:tc>
-          <w:tcPr>
-            <w:tcW w:w="2160" w:type="dxa"/>
-          </w:tcPr>
-          <w:p>
-            <w:r>
-              <w:rPr>
-                <w:sz w:val="20"/>
-              </w:rPr>
-              <w:t>Mô tả phim</w:t>
+              <w:t>email</w:t>
+            </w:r>
+          </w:p>
+        </w:tc>
+        <w:tc>
+          <w:tcPr>
+            <w:tcW w:w="2160" w:type="dxa"/>
+          </w:tcPr>
+          <w:p>
+            <w:r>
+              <w:rPr>
+                <w:sz w:val="20"/>
+              </w:rPr>
+              <w:t>VARCHAR(100)</w:t>
+            </w:r>
+          </w:p>
+        </w:tc>
+        <w:tc>
+          <w:tcPr>
+            <w:tcW w:w="2160" w:type="dxa"/>
+          </w:tcPr>
+          <w:p>
+            <w:r>
+              <w:rPr>
+                <w:sz w:val="20"/>
+              </w:rPr>
+              <w:t>UNIQUE, NULL</w:t>
+            </w:r>
+          </w:p>
+        </w:tc>
+        <w:tc>
+          <w:tcPr>
+            <w:tcW w:w="2160" w:type="dxa"/>
+          </w:tcPr>
+          <w:p>
+            <w:r>
+              <w:rPr>
+                <w:sz w:val="20"/>
+              </w:rPr>
+              <w:t>Email</w:t>
+            </w:r>
+          </w:p>
+        </w:tc>
+      </w:tr>
+    </w:tbl>
+    <w:p>
+      <w:pPr>
+        <w:pStyle w:val="Heading2"/>
+      </w:pPr>
+      <w:r>
+        <w:rPr>
+          <w:rFonts w:ascii="Times New Roman" w:hAnsi="Times New Roman"/>
+        </w:rPr>
+        <w:t>6.2. Bảng movies</w:t>
+      </w:r>
+      <w:r>
+        <w:rPr>
+          <w:rFonts w:ascii="Times New Roman" w:hAnsi="Times New Roman"/>
+        </w:rPr>
+        <w:t xml:space="preserve"> Done</w:t>
+      </w:r>
+    </w:p>
+    <w:tbl>
+      <w:tblPr>
+        <w:tblStyle w:val="TableGrid"/>
+        <w:tblW w:w="0" w:type="auto"/>
+        <w:jc w:val="center"/>
+        <w:tblLook w:val="04A0" w:firstRow="1" w:lastRow="0" w:firstColumn="1" w:lastColumn="0" w:noHBand="0" w:noVBand="1"/>
+      </w:tblPr>
+      <w:tblGrid>
+        <w:gridCol w:w="2160"/>
+        <w:gridCol w:w="2160"/>
+        <w:gridCol w:w="2160"/>
+        <w:gridCol w:w="2160"/>
+      </w:tblGrid>
+      <w:tr>
+        <w:trPr>
+          <w:jc w:val="center"/>
+        </w:trPr>
+        <w:tc>
+          <w:tcPr>
+            <w:tcW w:w="2160" w:type="dxa"/>
+            <w:shd w:val="clear" w:color="auto" w:fill="D9E2F3"/>
+          </w:tcPr>
+          <w:p>
+            <w:pPr>
+              <w:jc w:val="center"/>
+            </w:pPr>
+            <w:r>
+              <w:rPr>
+                <w:b/>
+                <w:sz w:val="20"/>
+              </w:rPr>
+              <w:t>Cột</w:t>
+            </w:r>
+          </w:p>
+        </w:tc>
+        <w:tc>
+          <w:tcPr>
+            <w:tcW w:w="2160" w:type="dxa"/>
+            <w:shd w:val="clear" w:color="auto" w:fill="D9E2F3"/>
+          </w:tcPr>
+          <w:p>
+            <w:pPr>
+              <w:jc w:val="center"/>
+            </w:pPr>
+            <w:r>
+              <w:rPr>
+                <w:b/>
+                <w:sz w:val="20"/>
+              </w:rPr>
+              <w:t>Kiểu</w:t>
+            </w:r>
+          </w:p>
+        </w:tc>
+        <w:tc>
+          <w:tcPr>
+            <w:tcW w:w="2160" w:type="dxa"/>
+            <w:shd w:val="clear" w:color="auto" w:fill="D9E2F3"/>
+          </w:tcPr>
+          <w:p>
+            <w:pPr>
+              <w:jc w:val="center"/>
+            </w:pPr>
+            <w:r>
+              <w:rPr>
+                <w:b/>
+                <w:sz w:val="20"/>
+              </w:rPr>
+              <w:t>Ràng buộc</w:t>
+            </w:r>
+          </w:p>
+        </w:tc>
+        <w:tc>
+          <w:tcPr>
+            <w:tcW w:w="2160" w:type="dxa"/>
+            <w:shd w:val="clear" w:color="auto" w:fill="D9E2F3"/>
+          </w:tcPr>
+          <w:p>
+            <w:pPr>
+              <w:jc w:val="center"/>
+            </w:pPr>
+            <w:r>
+              <w:rPr>
+                <w:b/>
+                <w:sz w:val="20"/>
+              </w:rPr>
+              <w:t>Mô tả</w:t>
             </w:r>
           </w:p>
         </w:tc>
@@ -7511,6 +7069,658 @@
               <w:rPr>
                 <w:sz w:val="20"/>
               </w:rPr>
+              <w:t>movie_id</w:t>
+            </w:r>
+          </w:p>
+        </w:tc>
+        <w:tc>
+          <w:tcPr>
+            <w:tcW w:w="2160" w:type="dxa"/>
+          </w:tcPr>
+          <w:p>
+            <w:r>
+              <w:rPr>
+                <w:sz w:val="20"/>
+              </w:rPr>
+              <w:t>VARCHAR(20)</w:t>
+            </w:r>
+          </w:p>
+        </w:tc>
+        <w:tc>
+          <w:tcPr>
+            <w:tcW w:w="2160" w:type="dxa"/>
+          </w:tcPr>
+          <w:p>
+            <w:r>
+              <w:rPr>
+                <w:sz w:val="20"/>
+              </w:rPr>
+              <w:t>PK</w:t>
+            </w:r>
+            <w:r>
+              <w:rPr>
+                <w:sz w:val="20"/>
+              </w:rPr>
+              <w:t>,NOT NULL</w:t>
+            </w:r>
+          </w:p>
+        </w:tc>
+        <w:tc>
+          <w:tcPr>
+            <w:tcW w:w="2160" w:type="dxa"/>
+          </w:tcPr>
+          <w:p>
+            <w:r>
+              <w:rPr>
+                <w:sz w:val="20"/>
+              </w:rPr>
+              <w:t>Mã phim</w:t>
+            </w:r>
+          </w:p>
+        </w:tc>
+      </w:tr>
+      <w:tr>
+        <w:trPr>
+          <w:jc w:val="center"/>
+        </w:trPr>
+        <w:tc>
+          <w:tcPr>
+            <w:tcW w:w="2160" w:type="dxa"/>
+          </w:tcPr>
+          <w:p>
+            <w:r>
+              <w:rPr>
+                <w:sz w:val="20"/>
+              </w:rPr>
+              <w:t>title</w:t>
+            </w:r>
+          </w:p>
+        </w:tc>
+        <w:tc>
+          <w:tcPr>
+            <w:tcW w:w="2160" w:type="dxa"/>
+          </w:tcPr>
+          <w:p>
+            <w:r>
+              <w:rPr>
+                <w:sz w:val="20"/>
+              </w:rPr>
+              <w:t>NVARCHAR(200)</w:t>
+            </w:r>
+          </w:p>
+        </w:tc>
+        <w:tc>
+          <w:tcPr>
+            <w:tcW w:w="2160" w:type="dxa"/>
+          </w:tcPr>
+          <w:p>
+            <w:r>
+              <w:rPr>
+                <w:sz w:val="20"/>
+              </w:rPr>
+              <w:t>NOT NULL</w:t>
+            </w:r>
+          </w:p>
+        </w:tc>
+        <w:tc>
+          <w:tcPr>
+            <w:tcW w:w="2160" w:type="dxa"/>
+          </w:tcPr>
+          <w:p>
+            <w:r>
+              <w:rPr>
+                <w:sz w:val="20"/>
+              </w:rPr>
+              <w:t>Tên phim</w:t>
+            </w:r>
+          </w:p>
+        </w:tc>
+      </w:tr>
+      <w:tr>
+        <w:trPr>
+          <w:jc w:val="center"/>
+        </w:trPr>
+        <w:tc>
+          <w:tcPr>
+            <w:tcW w:w="2160" w:type="dxa"/>
+          </w:tcPr>
+          <w:p>
+            <w:r>
+              <w:rPr>
+                <w:sz w:val="20"/>
+              </w:rPr>
+              <w:t>genre</w:t>
+            </w:r>
+          </w:p>
+        </w:tc>
+        <w:tc>
+          <w:tcPr>
+            <w:tcW w:w="2160" w:type="dxa"/>
+          </w:tcPr>
+          <w:p>
+            <w:r>
+              <w:rPr>
+                <w:sz w:val="20"/>
+              </w:rPr>
+              <w:t>NVARCHAR(100)</w:t>
+            </w:r>
+          </w:p>
+        </w:tc>
+        <w:tc>
+          <w:tcPr>
+            <w:tcW w:w="2160" w:type="dxa"/>
+          </w:tcPr>
+          <w:p>
+            <w:r>
+              <w:rPr>
+                <w:sz w:val="20"/>
+              </w:rPr>
+              <w:t>NOT NULL</w:t>
+            </w:r>
+          </w:p>
+        </w:tc>
+        <w:tc>
+          <w:tcPr>
+            <w:tcW w:w="2160" w:type="dxa"/>
+          </w:tcPr>
+          <w:p>
+            <w:r>
+              <w:rPr>
+                <w:sz w:val="20"/>
+              </w:rPr>
+              <w:t>Thể loại</w:t>
+            </w:r>
+          </w:p>
+        </w:tc>
+      </w:tr>
+      <w:tr>
+        <w:trPr>
+          <w:jc w:val="center"/>
+        </w:trPr>
+        <w:tc>
+          <w:tcPr>
+            <w:tcW w:w="2160" w:type="dxa"/>
+          </w:tcPr>
+          <w:p>
+            <w:pPr>
+              <w:rPr>
+                <w:sz w:val="20"/>
+              </w:rPr>
+            </w:pPr>
+            <w:r>
+              <w:rPr>
+                <w:sz w:val="20"/>
+              </w:rPr>
+              <w:t>format_movie</w:t>
+            </w:r>
+          </w:p>
+          <w:p>
+            <w:pPr>
+              <w:rPr>
+                <w:sz w:val="20"/>
+              </w:rPr>
+            </w:pPr>
+          </w:p>
+        </w:tc>
+        <w:tc>
+          <w:tcPr>
+            <w:tcW w:w="2160" w:type="dxa"/>
+          </w:tcPr>
+          <w:p>
+            <w:pPr>
+              <w:rPr>
+                <w:sz w:val="20"/>
+              </w:rPr>
+            </w:pPr>
+            <w:r>
+              <w:rPr>
+                <w:sz w:val="20"/>
+              </w:rPr>
+              <w:t>VARCHAR</w:t>
+            </w:r>
+            <w:r>
+              <w:rPr>
+                <w:sz w:val="20"/>
+              </w:rPr>
+              <w:t>(20)</w:t>
+            </w:r>
+          </w:p>
+          <w:p>
+            <w:pPr>
+              <w:rPr>
+                <w:sz w:val="20"/>
+              </w:rPr>
+            </w:pPr>
+          </w:p>
+        </w:tc>
+        <w:tc>
+          <w:tcPr>
+            <w:tcW w:w="2160" w:type="dxa"/>
+          </w:tcPr>
+          <w:p>
+            <w:pPr>
+              <w:rPr>
+                <w:sz w:val="20"/>
+              </w:rPr>
+            </w:pPr>
+            <w:r>
+              <w:rPr>
+                <w:sz w:val="20"/>
+              </w:rPr>
+              <w:t>NOT NULL</w:t>
+            </w:r>
+          </w:p>
+        </w:tc>
+        <w:tc>
+          <w:tcPr>
+            <w:tcW w:w="2160" w:type="dxa"/>
+          </w:tcPr>
+          <w:p>
+            <w:pPr>
+              <w:rPr>
+                <w:sz w:val="20"/>
+              </w:rPr>
+            </w:pPr>
+            <w:r>
+              <w:rPr>
+                <w:sz w:val="20"/>
+              </w:rPr>
+              <w:t>Định dạng 2D,3D,IMAX</w:t>
+            </w:r>
+          </w:p>
+        </w:tc>
+      </w:tr>
+      <w:tr>
+        <w:trPr>
+          <w:jc w:val="center"/>
+        </w:trPr>
+        <w:tc>
+          <w:tcPr>
+            <w:tcW w:w="2160" w:type="dxa"/>
+          </w:tcPr>
+          <w:p>
+            <w:pPr>
+              <w:rPr>
+                <w:color w:val="000000" w:themeColor="text1"/>
+                <w:sz w:val="20"/>
+              </w:rPr>
+            </w:pPr>
+            <w:r>
+              <w:rPr>
+                <w:color w:val="000000" w:themeColor="text1"/>
+                <w:sz w:val="20"/>
+              </w:rPr>
+              <w:t>rating</w:t>
+            </w:r>
+          </w:p>
+        </w:tc>
+        <w:tc>
+          <w:tcPr>
+            <w:tcW w:w="2160" w:type="dxa"/>
+          </w:tcPr>
+          <w:p>
+            <w:pPr>
+              <w:rPr>
+                <w:color w:val="000000" w:themeColor="text1"/>
+                <w:sz w:val="20"/>
+              </w:rPr>
+            </w:pPr>
+            <w:r>
+              <w:rPr>
+                <w:color w:val="000000" w:themeColor="text1"/>
+                <w:sz w:val="20"/>
+              </w:rPr>
+              <w:t>Nvchar(50)</w:t>
+            </w:r>
+          </w:p>
+        </w:tc>
+        <w:tc>
+          <w:tcPr>
+            <w:tcW w:w="2160" w:type="dxa"/>
+          </w:tcPr>
+          <w:p>
+            <w:pPr>
+              <w:rPr>
+                <w:color w:val="000000" w:themeColor="text1"/>
+                <w:sz w:val="20"/>
+              </w:rPr>
+            </w:pPr>
+            <w:r>
+              <w:rPr>
+                <w:rFonts w:ascii="Consolas" w:hAnsi="Consolas"/>
+                <w:color w:val="000000" w:themeColor="text1"/>
+                <w:sz w:val="21"/>
+                <w:szCs w:val="21"/>
+              </w:rPr>
+              <w:t>Null</w:t>
+            </w:r>
+          </w:p>
+        </w:tc>
+        <w:tc>
+          <w:tcPr>
+            <w:tcW w:w="2160" w:type="dxa"/>
+          </w:tcPr>
+          <w:p>
+            <w:pPr>
+              <w:rPr>
+                <w:color w:val="000000" w:themeColor="text1"/>
+                <w:sz w:val="20"/>
+              </w:rPr>
+            </w:pPr>
+            <w:r>
+              <w:rPr>
+                <w:color w:val="000000" w:themeColor="text1"/>
+                <w:sz w:val="20"/>
+              </w:rPr>
+              <w:t>18+,16+.13+..</w:t>
+            </w:r>
+          </w:p>
+        </w:tc>
+      </w:tr>
+      <w:tr>
+        <w:trPr>
+          <w:jc w:val="center"/>
+        </w:trPr>
+        <w:tc>
+          <w:tcPr>
+            <w:tcW w:w="2160" w:type="dxa"/>
+          </w:tcPr>
+          <w:p>
+            <w:r>
+              <w:rPr>
+                <w:sz w:val="20"/>
+              </w:rPr>
+              <w:t>duration_mins</w:t>
+            </w:r>
+          </w:p>
+        </w:tc>
+        <w:tc>
+          <w:tcPr>
+            <w:tcW w:w="2160" w:type="dxa"/>
+          </w:tcPr>
+          <w:p>
+            <w:r>
+              <w:rPr>
+                <w:sz w:val="20"/>
+              </w:rPr>
+              <w:t>INT</w:t>
+            </w:r>
+          </w:p>
+        </w:tc>
+        <w:tc>
+          <w:tcPr>
+            <w:tcW w:w="2160" w:type="dxa"/>
+          </w:tcPr>
+          <w:p>
+            <w:r>
+              <w:rPr>
+                <w:sz w:val="20"/>
+              </w:rPr>
+              <w:t>NOT NULL, CHECK &gt; 0</w:t>
+            </w:r>
+          </w:p>
+        </w:tc>
+        <w:tc>
+          <w:tcPr>
+            <w:tcW w:w="2160" w:type="dxa"/>
+          </w:tcPr>
+          <w:p>
+            <w:r>
+              <w:rPr>
+                <w:sz w:val="20"/>
+              </w:rPr>
+              <w:t>Thời lượng (phút)</w:t>
+            </w:r>
+          </w:p>
+        </w:tc>
+      </w:tr>
+      <w:tr>
+        <w:trPr>
+          <w:jc w:val="center"/>
+        </w:trPr>
+        <w:tc>
+          <w:tcPr>
+            <w:tcW w:w="2160" w:type="dxa"/>
+          </w:tcPr>
+          <w:p>
+            <w:r>
+              <w:rPr>
+                <w:sz w:val="20"/>
+              </w:rPr>
+              <w:t>Language</w:t>
+            </w:r>
+          </w:p>
+        </w:tc>
+        <w:tc>
+          <w:tcPr>
+            <w:tcW w:w="2160" w:type="dxa"/>
+          </w:tcPr>
+          <w:p>
+            <w:r>
+              <w:rPr>
+                <w:sz w:val="20"/>
+              </w:rPr>
+              <w:t>NVARCHAR(50)</w:t>
+            </w:r>
+          </w:p>
+        </w:tc>
+        <w:tc>
+          <w:tcPr>
+            <w:tcW w:w="2160" w:type="dxa"/>
+          </w:tcPr>
+          <w:p>
+            <w:r>
+              <w:rPr>
+                <w:sz w:val="20"/>
+              </w:rPr>
+              <w:t>NULL</w:t>
+            </w:r>
+          </w:p>
+        </w:tc>
+        <w:tc>
+          <w:tcPr>
+            <w:tcW w:w="2160" w:type="dxa"/>
+          </w:tcPr>
+          <w:p>
+            <w:r>
+              <w:rPr>
+                <w:sz w:val="20"/>
+              </w:rPr>
+              <w:t>Ngôn ngữ</w:t>
+            </w:r>
+          </w:p>
+        </w:tc>
+      </w:tr>
+      <w:tr>
+        <w:trPr>
+          <w:jc w:val="center"/>
+        </w:trPr>
+        <w:tc>
+          <w:tcPr>
+            <w:tcW w:w="2160" w:type="dxa"/>
+          </w:tcPr>
+          <w:p>
+            <w:r>
+              <w:rPr>
+                <w:sz w:val="20"/>
+              </w:rPr>
+              <w:t>release_date</w:t>
+            </w:r>
+          </w:p>
+        </w:tc>
+        <w:tc>
+          <w:tcPr>
+            <w:tcW w:w="2160" w:type="dxa"/>
+          </w:tcPr>
+          <w:p>
+            <w:r>
+              <w:rPr>
+                <w:sz w:val="20"/>
+              </w:rPr>
+              <w:t>DATE</w:t>
+            </w:r>
+          </w:p>
+        </w:tc>
+        <w:tc>
+          <w:tcPr>
+            <w:tcW w:w="2160" w:type="dxa"/>
+          </w:tcPr>
+          <w:p>
+            <w:r>
+              <w:rPr>
+                <w:sz w:val="20"/>
+              </w:rPr>
+              <w:t>NULL</w:t>
+            </w:r>
+          </w:p>
+        </w:tc>
+        <w:tc>
+          <w:tcPr>
+            <w:tcW w:w="2160" w:type="dxa"/>
+          </w:tcPr>
+          <w:p>
+            <w:r>
+              <w:rPr>
+                <w:sz w:val="20"/>
+              </w:rPr>
+              <w:t>Ngày phát hành</w:t>
+            </w:r>
+          </w:p>
+        </w:tc>
+      </w:tr>
+      <w:tr>
+        <w:trPr>
+          <w:jc w:val="center"/>
+        </w:trPr>
+        <w:tc>
+          <w:tcPr>
+            <w:tcW w:w="2160" w:type="dxa"/>
+          </w:tcPr>
+          <w:p>
+            <w:r>
+              <w:rPr>
+                <w:sz w:val="20"/>
+              </w:rPr>
+              <w:t>status</w:t>
+            </w:r>
+          </w:p>
+        </w:tc>
+        <w:tc>
+          <w:tcPr>
+            <w:tcW w:w="2160" w:type="dxa"/>
+          </w:tcPr>
+          <w:p>
+            <w:r>
+              <w:rPr>
+                <w:sz w:val="20"/>
+              </w:rPr>
+              <w:t>VARCHAR(20)</w:t>
+            </w:r>
+          </w:p>
+        </w:tc>
+        <w:tc>
+          <w:tcPr>
+            <w:tcW w:w="2160" w:type="dxa"/>
+          </w:tcPr>
+          <w:p>
+            <w:r>
+              <w:rPr>
+                <w:sz w:val="20"/>
+              </w:rPr>
+              <w:t>NOT NULL, DEFAULT 'ACTIVE'</w:t>
+            </w:r>
+          </w:p>
+        </w:tc>
+        <w:tc>
+          <w:tcPr>
+            <w:tcW w:w="2160" w:type="dxa"/>
+          </w:tcPr>
+          <w:p>
+            <w:r>
+              <w:rPr>
+                <w:sz w:val="20"/>
+              </w:rPr>
+              <w:t>ACTIVE | INACTIVE</w:t>
+            </w:r>
+          </w:p>
+        </w:tc>
+      </w:tr>
+      <w:tr>
+        <w:trPr>
+          <w:jc w:val="center"/>
+        </w:trPr>
+        <w:tc>
+          <w:tcPr>
+            <w:tcW w:w="2160" w:type="dxa"/>
+          </w:tcPr>
+          <w:p>
+            <w:r>
+              <w:rPr>
+                <w:sz w:val="20"/>
+              </w:rPr>
+              <w:t>description</w:t>
+            </w:r>
+          </w:p>
+        </w:tc>
+        <w:tc>
+          <w:tcPr>
+            <w:tcW w:w="2160" w:type="dxa"/>
+          </w:tcPr>
+          <w:p>
+            <w:pPr>
+              <w:rPr>
+                <w:sz w:val="20"/>
+              </w:rPr>
+            </w:pPr>
+            <w:r>
+              <w:rPr>
+                <w:sz w:val="20"/>
+              </w:rPr>
+              <w:t>NVARCHAR(MAX)</w:t>
+            </w:r>
+          </w:p>
+          <w:p/>
+        </w:tc>
+        <w:tc>
+          <w:tcPr>
+            <w:tcW w:w="2160" w:type="dxa"/>
+          </w:tcPr>
+          <w:p>
+            <w:r>
+              <w:rPr>
+                <w:sz w:val="20"/>
+              </w:rPr>
+              <w:t>NULL</w:t>
+            </w:r>
+          </w:p>
+        </w:tc>
+        <w:tc>
+          <w:tcPr>
+            <w:tcW w:w="2160" w:type="dxa"/>
+          </w:tcPr>
+          <w:p>
+            <w:r>
+              <w:rPr>
+                <w:sz w:val="20"/>
+              </w:rPr>
+              <w:t>Mô tả phim</w:t>
+            </w:r>
+          </w:p>
+        </w:tc>
+      </w:tr>
+      <w:tr>
+        <w:trPr>
+          <w:jc w:val="center"/>
+        </w:trPr>
+        <w:tc>
+          <w:tcPr>
+            <w:tcW w:w="2160" w:type="dxa"/>
+          </w:tcPr>
+          <w:p>
+            <w:r>
+              <w:rPr>
+                <w:sz w:val="20"/>
+              </w:rPr>
               <w:t>poster_url</w:t>
             </w:r>
           </w:p>
@@ -7524,7 +7734,19 @@
               <w:rPr>
                 <w:sz w:val="20"/>
               </w:rPr>
-              <w:t>VARCHAR(500)</w:t>
+              <w:t>VARCHAR(</w:t>
+            </w:r>
+            <w:r>
+              <w:rPr>
+                <w:sz w:val="20"/>
+              </w:rPr>
+              <w:t>255</w:t>
+            </w:r>
+            <w:r>
+              <w:rPr>
+                <w:sz w:val="20"/>
+              </w:rPr>
+              <w:t>)</w:t>
             </w:r>
           </w:p>
         </w:tc>
@@ -7867,19 +8089,27 @@
               <w:rPr>
                 <w:sz w:val="20"/>
               </w:rPr>
-              <w:t>NOT NULL, CHECK &gt; 0</w:t>
-            </w:r>
-          </w:p>
-        </w:tc>
-        <w:tc>
-          <w:tcPr>
-            <w:tcW w:w="2160" w:type="dxa"/>
-          </w:tcPr>
-          <w:p>
-            <w:r>
-              <w:rPr>
-                <w:sz w:val="20"/>
-              </w:rPr>
+              <w:t xml:space="preserve">NOT NULL, CHECK &gt; </w:t>
+            </w:r>
+            <w:r>
+              <w:rPr>
+                <w:sz w:val="20"/>
+              </w:rPr>
+              <w:lastRenderedPageBreak/>
+              <w:t>0</w:t>
+            </w:r>
+          </w:p>
+        </w:tc>
+        <w:tc>
+          <w:tcPr>
+            <w:tcW w:w="2160" w:type="dxa"/>
+          </w:tcPr>
+          <w:p>
+            <w:r>
+              <w:rPr>
+                <w:sz w:val="20"/>
+              </w:rPr>
+              <w:lastRenderedPageBreak/>
               <w:t>Tổng hàng</w:t>
             </w:r>
           </w:p>
@@ -7951,13 +8181,19 @@
             <w:tcW w:w="2160" w:type="dxa"/>
           </w:tcPr>
           <w:p>
-            <w:r>
-              <w:rPr>
-                <w:sz w:val="20"/>
-              </w:rPr>
-              <w:t>is_active</w:t>
-            </w:r>
-          </w:p>
+            <w:pPr>
+              <w:rPr>
+                <w:sz w:val="20"/>
+              </w:rPr>
+            </w:pPr>
+            <w:r>
+              <w:rPr>
+                <w:sz w:val="20"/>
+              </w:rPr>
+              <w:t>status</w:t>
+            </w:r>
+          </w:p>
+          <w:p/>
         </w:tc>
         <w:tc>
           <w:tcPr>
@@ -7994,7 +8230,7 @@
               <w:rPr>
                 <w:sz w:val="20"/>
               </w:rPr>
-              <w:t>Đang hoạt động</w:t>
+              <w:t>ACTIVE | INACTIVE</w:t>
             </w:r>
           </w:p>
         </w:tc>
@@ -8381,7 +8617,191 @@
               <w:rPr>
                 <w:sz w:val="20"/>
               </w:rPr>
-              <w:t>REGULAR | VIP | ACCESSIBLE</w:t>
+              <w:t>REGULAR | VIP |</w:t>
+            </w:r>
+          </w:p>
+        </w:tc>
+      </w:tr>
+      <w:tr>
+        <w:trPr>
+          <w:jc w:val="center"/>
+        </w:trPr>
+        <w:tc>
+          <w:tcPr>
+            <w:tcW w:w="2160" w:type="dxa"/>
+          </w:tcPr>
+          <w:p>
+            <w:pPr>
+              <w:rPr>
+                <w:sz w:val="20"/>
+              </w:rPr>
+            </w:pPr>
+            <w:r>
+              <w:rPr>
+                <w:sz w:val="20"/>
+              </w:rPr>
+              <w:t>is_broken</w:t>
+            </w:r>
+          </w:p>
+          <w:p>
+            <w:pPr>
+              <w:rPr>
+                <w:sz w:val="20"/>
+              </w:rPr>
+            </w:pPr>
+          </w:p>
+        </w:tc>
+        <w:tc>
+          <w:tcPr>
+            <w:tcW w:w="2160" w:type="dxa"/>
+          </w:tcPr>
+          <w:p>
+            <w:pPr>
+              <w:rPr>
+                <w:sz w:val="20"/>
+              </w:rPr>
+            </w:pPr>
+            <w:r>
+              <w:rPr>
+                <w:sz w:val="20"/>
+              </w:rPr>
+              <w:t>BIT</w:t>
+            </w:r>
+          </w:p>
+          <w:p>
+            <w:pPr>
+              <w:rPr>
+                <w:sz w:val="20"/>
+              </w:rPr>
+            </w:pPr>
+          </w:p>
+        </w:tc>
+        <w:tc>
+          <w:tcPr>
+            <w:tcW w:w="2160" w:type="dxa"/>
+          </w:tcPr>
+          <w:p>
+            <w:pPr>
+              <w:rPr>
+                <w:sz w:val="20"/>
+              </w:rPr>
+            </w:pPr>
+            <w:r>
+              <w:rPr>
+                <w:i/>
+                <w:iCs/>
+                <w:sz w:val="20"/>
+              </w:rPr>
+              <w:t>DEFAULT</w:t>
+            </w:r>
+          </w:p>
+          <w:p>
+            <w:pPr>
+              <w:rPr>
+                <w:sz w:val="20"/>
+              </w:rPr>
+            </w:pPr>
+          </w:p>
+        </w:tc>
+        <w:tc>
+          <w:tcPr>
+            <w:tcW w:w="2160" w:type="dxa"/>
+          </w:tcPr>
+          <w:p>
+            <w:pPr>
+              <w:rPr>
+                <w:sz w:val="20"/>
+              </w:rPr>
+            </w:pPr>
+            <w:r>
+              <w:rPr>
+                <w:sz w:val="20"/>
+              </w:rPr>
+              <w:t>0</w:t>
+            </w:r>
+          </w:p>
+          <w:p>
+            <w:pPr>
+              <w:rPr>
+                <w:sz w:val="20"/>
+              </w:rPr>
+            </w:pPr>
+          </w:p>
+        </w:tc>
+      </w:tr>
+      <w:tr>
+        <w:trPr>
+          <w:jc w:val="center"/>
+        </w:trPr>
+        <w:tc>
+          <w:tcPr>
+            <w:tcW w:w="2160" w:type="dxa"/>
+          </w:tcPr>
+          <w:p>
+            <w:pPr>
+              <w:rPr>
+                <w:sz w:val="20"/>
+              </w:rPr>
+            </w:pPr>
+            <w:r>
+              <w:rPr>
+                <w:sz w:val="20"/>
+              </w:rPr>
+              <w:t>seat_price</w:t>
+            </w:r>
+          </w:p>
+        </w:tc>
+        <w:tc>
+          <w:tcPr>
+            <w:tcW w:w="2160" w:type="dxa"/>
+          </w:tcPr>
+          <w:p>
+            <w:pPr>
+              <w:rPr>
+                <w:sz w:val="20"/>
+              </w:rPr>
+            </w:pPr>
+            <w:r>
+              <w:rPr>
+                <w:sz w:val="20"/>
+              </w:rPr>
+              <w:t>FLOAT</w:t>
+            </w:r>
+          </w:p>
+        </w:tc>
+        <w:tc>
+          <w:tcPr>
+            <w:tcW w:w="2160" w:type="dxa"/>
+          </w:tcPr>
+          <w:p>
+            <w:pPr>
+              <w:rPr>
+                <w:sz w:val="20"/>
+              </w:rPr>
+            </w:pPr>
+            <w:r>
+              <w:rPr>
+                <w:sz w:val="20"/>
+              </w:rPr>
+              <w:t>NOT NULL</w:t>
+            </w:r>
+          </w:p>
+        </w:tc>
+        <w:tc>
+          <w:tcPr>
+            <w:tcW w:w="2160" w:type="dxa"/>
+          </w:tcPr>
+          <w:p>
+            <w:pPr>
+              <w:rPr>
+                <w:sz w:val="20"/>
+              </w:rPr>
+            </w:pPr>
+            <w:r>
+              <w:rPr>
+                <w:sz w:val="20"/>
+              </w:rPr>
+              <w:t>Giá của ghế</w:t>
             </w:r>
           </w:p>
         </w:tc>
@@ -9238,7 +9658,6 @@
               <w:rPr>
                 <w:sz w:val="20"/>
               </w:rPr>
-              <w:lastRenderedPageBreak/>
               <w:t>status</w:t>
             </w:r>
           </w:p>
@@ -9577,6 +9996,7 @@
               <w:rPr>
                 <w:sz w:val="20"/>
               </w:rPr>
+              <w:lastRenderedPageBreak/>
               <w:t>created_at</w:t>
             </w:r>
           </w:p>
@@ -11145,7 +11565,6 @@
         <w:rPr>
           <w:rFonts w:ascii="Times New Roman" w:hAnsi="Times New Roman"/>
         </w:rPr>
-        <w:lastRenderedPageBreak/>
         <w:t>7. Sơ đồ ERD (Entity Relationship Diagram)</w:t>
       </w:r>
     </w:p>
@@ -11194,6 +11613,7 @@
         <w:pStyle w:val="ListBullet"/>
       </w:pPr>
       <w:r>
+        <w:lastRenderedPageBreak/>
         <w:t>show_seats.seat_id → seats.seat_id</w:t>
       </w:r>
     </w:p>
@@ -11795,7 +12215,6 @@
         <w:pStyle w:val="Heading2"/>
       </w:pPr>
       <w:r>
-        <w:lastRenderedPageBreak/>
         <w:t>9.3. Luồng huỷ Ticket — hoàn trạng ShowSeat</w:t>
       </w:r>
     </w:p>
@@ -11809,6 +12228,7 @@
         <w:pStyle w:val="Heading2"/>
       </w:pPr>
       <w:r>
+        <w:lastRenderedPageBreak/>
         <w:t>9.4. Validation minTicketQuantity của Discount</w:t>
       </w:r>
     </w:p>
@@ -12004,9 +12424,9 @@
       <w:lvlJc w:val="left"/>
       <w:pPr>
         <w:tabs>
-          <w:tab w:val="num" w:pos="360"/>
+          <w:tab w:val="num" w:pos="2770"/>
         </w:tabs>
-        <w:ind w:left="360" w:hanging="360"/>
+        <w:ind w:left="2770" w:hanging="360"/>
       </w:pPr>
       <w:rPr>
         <w:rFonts w:ascii="Symbol" w:hAnsi="Symbol" w:hint="default"/>
@@ -12650,7 +13070,6 @@
   <w:style w:type="character" w:default="1" w:styleId="DefaultParagraphFont">
     <w:name w:val="Default Paragraph Font"/>
     <w:uiPriority w:val="1"/>
-    <w:semiHidden/>
     <w:unhideWhenUsed/>
   </w:style>
   <w:style w:type="table" w:default="1" w:styleId="TableNormal">

</xml_diff>